<commit_message>
Prepare v1.0 source and submission files
Clarify public FlightSketch access without a separate permission attestation, preserve the no-redistribution boundary, update manuscript and supplement, and document the partial-reproducibility scope. No new training or numerical changes.
</commit_message>
<xml_diff>
--- a/Acta_Supplement_Submission.docx
+++ b/Acta_Supplement_Submission.docx
@@ -11373,7 +11373,7 @@
         <w:pStyle w:val="Heading1"/>
       </w:pPr>
       <w:r>
-        <w:t>S10. Data, code, permissions, and submission checklist</w:t>
+        <w:t>S10. Data, code, sources, and submission checklist</w:t>
       </w:r>
     </w:p>
     <w:p>
@@ -11381,12 +11381,12 @@
         <w:pStyle w:val="Heading2"/>
       </w:pPr>
       <w:r>
-        <w:t>S10.1 Data and permissions boundary</w:t>
+        <w:t>S10.1 Data provenance and sharing boundary</w:t>
       </w:r>
     </w:p>
     <w:p>
       <w:r>
-        <w:t>RQ1 results derive from the archived trajectory cohort and split records described above. RQ2 used public FlightSketch downloads under research permission reported by the author. Raw-file redistribution must remain within the scope of the written authorization and source terms. Accordingly, this SI reports derived metadata, aggregate statistics, and integrity identifiers; it does not itself grant permission to redistribute third-party raw CSV files.</w:t>
+        <w:t>RQ1 results derive from the archived trajectory cohort and split records described above. RQ2 used publicly accessible FlightSketch flight pages and downloadable CSV files. Public download access supports inspection and analysis but does not by itself establish a license to republish the raw files. Accordingly, this SI reports derived metadata, aggregate statistics, and integrity identifiers; the third-party raw CSV files are not included in the package.</w:t>
       </w:r>
     </w:p>
     <w:p>
@@ -11412,7 +11412,7 @@
         <w:spacing w:after="30"/>
       </w:pPr>
       <w:r>
-        <w:t>The author confirms that research-use permission for FlightSketch data was obtained. FlightSketch and its flight-log contributors are acknowledged as the data sources. Raw telemetry is not redistributed in the package.</w:t>
+        <w:t>FlightSketch and its flight-log contributors are acknowledged as the data sources. The public flight index is https://flightsketch.com/flight-filter/ and individual records are available at https://flightsketch.com/flights/&lt;id&gt;/. Raw telemetry is not redistributed in the package.</w:t>
       </w:r>
     </w:p>
     <w:p>
@@ -11430,7 +11430,7 @@
         <w:spacing w:after="30"/>
       </w:pPr>
       <w:r>
-        <w:t>The repository software and documentation licenses do not extend to third-party telemetry. Source attribution and permission terms continue to apply to the underlying data.</w:t>
+        <w:t>The repository software and documentation licenses do not extend to third-party telemetry. Source attribution and any applicable source terms continue to apply to the underlying data.</w:t>
       </w:r>
     </w:p>
     <w:p>

</xml_diff>